<commit_message>
Remove personal information placeholders from reports
</commit_message>
<xml_diff>
--- a/docs/report.docx
+++ b/docs/report.docx
@@ -8,11 +8,6 @@
       </w:pPr>
       <w:r>
         <w:t>Gensim 词语表示学习与 fastText 文本分类实验报告</w:t>
-      </w:r>
-    </w:p>
-    <w:p>
-      <w:r>
-        <w:t>姓名 __________    学号 __________    课程 __________</w:t>
       </w:r>
     </w:p>
     <w:p>

</xml_diff>